<commit_message>
docs(paper): abstract and index terms in regular weight
</commit_message>
<xml_diff>
--- a/docs/paper/AeroGard_ResearchPaper.docx
+++ b/docs/paper/AeroGard_ResearchPaper.docx
@@ -226,14 +226,12 @@
       </w:r>
       <w:r>
         <w:rPr>
-          <w:b/>
           <w:sz w:val="18"/>
         </w:rPr>
         <w:t>People with asthma or chronic obstructive pulmonary disease (COPD) usually learn about air pollution from a city-wide index that describes the present, not the air around them tomorrow, and says nothing about their own exposure or health. We built AeroGard, a software prototype that forecasts air quality 24 hours ahead at a user’s location, estimates personal exposure, and turns these with a symptom diary into a calibrated, explained personal risk and an alert. For Bengaluru we ingested 753,481 hourly observations from 14 regulatory monitors (February 2025 to September 2026) with reanalysis weather. A direct multi-horizon LightGBM forecaster reached a 24-hour PM</w:t>
       </w:r>
       <w:r>
         <w:rPr>
-          <w:b/>
           <w:sz w:val="18"/>
           <w:vertAlign w:val="subscript"/>
         </w:rPr>
@@ -241,7 +239,6 @@
       </w:r>
       <w:r>
         <w:rPr>
-          <w:b/>
           <w:sz w:val="18"/>
         </w:rPr>
         <w:t xml:space="preserve"> mean absolute error of 5.78 µg/m³ on an untouched test period, 23% better than persistence. Because no respiratory outcome data exist for the city, the risk layer was developed on a clearly labelled synthetic cohort of 400 patients simulated inside the real pollution field. A LightGBM model with a shared trunk and asthma and COPD heads, Platt-calibrated, reached an AUROC of 0.708 (95% CI 0.684–0.732) with an expected calibration error of 0.0025, and 0.721 for patients never seen in training. The symptom diary carried the signal; estimated exposure added no measurable discrimination. Exact TreeSHAP explanations, scaled to add up to the probability shown, and an idempotent alert engine are served through an authenticated, consent-aware API. These are synthetic-data results, not clinical validation.</w:t>
@@ -262,7 +259,6 @@
       </w:r>
       <w:r>
         <w:rPr>
-          <w:b/>
           <w:sz w:val="18"/>
         </w:rPr>
         <w:t>air quality forecasting, PM2.5, LightGBM, exposure assessment, asthma, COPD, risk prediction, probability calibration, SHAP, synthetic cohort, data leakage</w:t>

</xml_diff>